<commit_message>
Economic reframing (title, abstract, introduction, results, policy implications) and provenance audit of the original Wind/BIS exports (CI construction verified; S15, S18)
</commit_message>
<xml_diff>
--- a/manuscript/Author_Check_Responses.docx
+++ b/manuscript/Author_Check_Responses.docx
@@ -2,7 +2,7 @@
 <file path=word/document.xml><?xml version="1.0" encoding="utf-8"?>
 <w:document xmlns:w="http://schemas.openxmlformats.org/wordprocessingml/2006/main" xmlns:m="http://schemas.openxmlformats.org/officeDocument/2006/math" xmlns:r="http://schemas.openxmlformats.org/officeDocument/2006/relationships" xmlns:o="urn:schemas-microsoft-com:office:office" xmlns:v="urn:schemas-microsoft-com:vml" xmlns:w10="urn:schemas-microsoft-com:office:word" xmlns:a="http://schemas.openxmlformats.org/drawingml/2006/main" xmlns:pic="http://schemas.openxmlformats.org/drawingml/2006/picture" xmlns:wp="http://schemas.openxmlformats.org/drawingml/2006/wordprocessingDrawing">
   <w:body>
-    <w:bookmarkStart w:id="19" w:name="X1c1c0fd8b80a5de9de91dad6b1ed86f5f91fd5d"/>
+    <w:bookmarkStart w:id="20" w:name="X1c1c0fd8b80a5de9de91dad6b1ed86f5f91fd5d"/>
     <w:p>
       <w:pPr>
         <w:pStyle w:val="Heading1"/>
@@ -73,7 +73,43 @@
         </w:numPr>
       </w:pPr>
       <w:r>
-        <w:t xml:space="preserve">Not recoverable: the Wind series codes, the exact turnover definition and any interpolation. The Panel B CI column (labelled domestic-currency FX-derivatives turnover) varies monthly in every country (Russia has runs of zeros), so it is not a step-filled triennial survey value, but its construction is stated as unverified (Sections 3.1, 6.3; Table S15).</w:t>
+        <w:t xml:space="preserve">Original exports (manuscript/original, now data/raw/original_exports with SHA256SUMS.txt; not redistributed): 9 workbooks created 2023-05-31 to 2023-06-02 according to their internal metadata. The file-system timestamps of the copies show the copying date, so the export dates are taken from docProps/core.xml (Table S18).</w:t>
+      </w:r>
+    </w:p>
+    <w:p>
+      <w:pPr>
+        <w:pStyle w:val="Compact"/>
+        <w:numPr>
+          <w:ilvl w:val="0"/>
+          <w:numId w:val="1001"/>
+        </w:numPr>
+      </w:pPr>
+      <w:r>
+        <w:t xml:space="preserve">CI construction, now verified: the Panel B CI column equals the currency’s monthly FX-derivatives turnover divided by the</w:t>
+      </w:r>
+      <w:r>
+        <w:t xml:space="preserve"> </w:t>
+      </w:r>
+      <w:r>
+        <w:t xml:space="preserve">‘TO1: Total all currencies’</w:t>
+      </w:r>
+      <w:r>
+        <w:t xml:space="preserve"> </w:t>
+      </w:r>
+      <w:r>
+        <w:t xml:space="preserve">row of a BIS Statistics Explorer export of 2023-05-31 (1993-01 to 2022-12); all 1,188 values of the 9 countries match, and the same column in Panel A matches as well. The China-only columns (international bonds outstanding and issuance, RMB reserve share, overseas RMB loans relative to cross-border credit) and the emerging/income flags are also reproduced; quarterly sources were linearly interpolated or backward-filled to months (Table S15). These columns are not used in the analysis. The lending ratio divides CNY 100 m by USD m without conversion.</w:t>
+      </w:r>
+    </w:p>
+    <w:p>
+      <w:pPr>
+        <w:pStyle w:val="Compact"/>
+        <w:numPr>
+          <w:ilvl w:val="0"/>
+          <w:numId w:val="1001"/>
+        </w:numPr>
+      </w:pPr>
+      <w:r>
+        <w:t xml:space="preserve">Still not recoverable: the SWIFT share series (no export retained) and Wind series codes (the exports carry indicator names only). Sections 3.1, 3.3 and 6.3, the data availability statement and Table S15 were revised accordingly; step0b_provenance_audit.py reproduces the checks and the consistency audit fails if the CI match is not exact.</w:t>
       </w:r>
     </w:p>
     <w:bookmarkEnd w:id="9"/>
@@ -211,7 +247,7 @@
         </w:numPr>
       </w:pPr>
       <w:r>
-        <w:t xml:space="preserve">S1-S17 are in Supplementary_Material.docx; S12-S17 are regenerated from the corrected outputs.</w:t>
+        <w:t xml:space="preserve">S1-S18 are in Supplementary_Material.docx; S12-S18 are regenerated from the corrected outputs.</w:t>
       </w:r>
     </w:p>
     <w:bookmarkEnd w:id="12"/>
@@ -289,7 +325,7 @@
         </w:numPr>
       </w:pPr>
       <w:r>
-        <w:t xml:space="preserve">MacroRisk_reproduction_anonymized.zip (code, splits, protocol, timing audit, row-level predictions, S1-S17) is rebuilt with this revision. The manuscript is generated from code, so the editorial comments are not carried over. Title_Page.docx is separate; the declarations and the anonymous mirror link still need the authors.</w:t>
+        <w:t xml:space="preserve">MacroRisk_reproduction_anonymized.zip (code, splits, protocol, timing audit, row-level predictions, S1-S18) is rebuilt with this revision. The manuscript is generated from code, so the editorial comments are not carried over. Title_Page.docx is separate; the declarations and the anonymous mirror link still need the authors.</w:t>
       </w:r>
     </w:p>
     <w:bookmarkEnd w:id="15"/>
@@ -337,12 +373,82 @@
       </w:r>
     </w:p>
     <w:bookmarkEnd w:id="17"/>
-    <w:bookmarkStart w:id="18" w:name="X045f2bf2107f1a5153141332173fe44ba16d4d0"/>
+    <w:bookmarkStart w:id="18" w:name="Xd0cc067e3ab3fb69de5cad6fcd45097993037eb"/>
     <w:p>
       <w:pPr>
         <w:pStyle w:val="Heading2"/>
       </w:pPr>
       <w:r>
+        <w:t xml:space="preserve">10. Abstract and economic framing (comments of 21 October 2026)</w:t>
+      </w:r>
+    </w:p>
+    <w:p>
+      <w:pPr>
+        <w:pStyle w:val="Compact"/>
+        <w:numPr>
+          <w:ilvl w:val="0"/>
+          <w:numId w:val="1010"/>
+        </w:numPr>
+      </w:pPr>
+      <w:r>
+        <w:t xml:space="preserve">Title now states the economic question. The abstract follows background, question, design, three findings and implications with scope, and keeps only a few numbers; it remains within 230 words.</w:t>
+      </w:r>
+    </w:p>
+    <w:p>
+      <w:pPr>
+        <w:pStyle w:val="Compact"/>
+        <w:numPr>
+          <w:ilvl w:val="0"/>
+          <w:numId w:val="1010"/>
+        </w:numPr>
+      </w:pPr>
+      <w:r>
+        <w:t xml:space="preserve">Introduction: economic motivation first; one main question (can the information in CI and IQ be turned into short-term warning value beyond macro indicators and persistence?) with three steps. The replication is now the first step of the design, not a separate research question.</w:t>
+      </w:r>
+    </w:p>
+    <w:p>
+      <w:pPr>
+        <w:pStyle w:val="Compact"/>
+        <w:numPr>
+          <w:ilvl w:val="0"/>
+          <w:numId w:val="1010"/>
+        </w:numPr>
+      </w:pPr>
+      <w:r>
+        <w:t xml:space="preserve">Results 5.1-5.9: each subsection opens with the finding in its heading and first sentence, then gives the metrics, then a short economic interpretation (volatility clustering and country risk levels; CI as a slow-moving cross-sectional exposure attribute; IQ as a baseline-risk adjustment; onsets; loss functions; timing; heterogeneity; fallback trade-off). New build-time claims guard the new directional statements.</w:t>
+      </w:r>
+    </w:p>
+    <w:p>
+      <w:pPr>
+        <w:pStyle w:val="Compact"/>
+        <w:numPr>
+          <w:ilvl w:val="0"/>
+          <w:numId w:val="1010"/>
+        </w:numPr>
+      </w:pPr>
+      <w:r>
+        <w:t xml:space="preserve">Section 6.2</w:t>
+      </w:r>
+      <w:r>
+        <w:t xml:space="preserve"> </w:t>
+      </w:r>
+      <w:r>
+        <w:t xml:space="preserve">‘Economic interpretation and policy implications’</w:t>
+      </w:r>
+      <w:r>
+        <w:t xml:space="preserve"> </w:t>
+      </w:r>
+      <w:r>
+        <w:t xml:space="preserve">replaces the decision-support implications subsection: five bounded implications (prioritisation rather than alarms; benchmark before adoption; judge by cost as well as ranking; no direct translation of threshold regressions; fallback as a trade-off) and an explicit scope paragraph. Table 12 and the conclusion use the same framing.</w:t>
+      </w:r>
+    </w:p>
+    <w:bookmarkEnd w:id="18"/>
+    <w:bookmarkStart w:id="19" w:name="X045f2bf2107f1a5153141332173fe44ba16d4d0"/>
+    <w:p>
+      <w:pPr>
+        <w:pStyle w:val="Heading2"/>
+      </w:pPr>
+      <w:r>
         <w:t xml:space="preserve">Results that changed with the inner-threshold correction</w:t>
       </w:r>
     </w:p>
@@ -351,7 +457,7 @@
         <w:pStyle w:val="Compact"/>
         <w:numPr>
           <w:ilvl w:val="0"/>
-          <w:numId w:val="1010"/>
+          <w:numId w:val="1011"/>
         </w:numPr>
       </w:pPr>
       <w:r>
@@ -363,7 +469,7 @@
         <w:pStyle w:val="Compact"/>
         <w:numPr>
           <w:ilvl w:val="0"/>
-          <w:numId w:val="1010"/>
+          <w:numId w:val="1011"/>
         </w:numPr>
       </w:pPr>
       <w:r>
@@ -375,7 +481,7 @@
         <w:pStyle w:val="Compact"/>
         <w:numPr>
           <w:ilvl w:val="0"/>
-          <w:numId w:val="1010"/>
+          <w:numId w:val="1011"/>
         </w:numPr>
       </w:pPr>
       <w:r>
@@ -387,15 +493,15 @@
         <w:pStyle w:val="Compact"/>
         <w:numPr>
           <w:ilvl w:val="0"/>
-          <w:numId w:val="1010"/>
+          <w:numId w:val="1011"/>
         </w:numPr>
       </w:pPr>
       <w:r>
         <w:t xml:space="preserve">Of 766 audited numbers, 468 differ from the first draft (table_change_v1_v2.csv).</w:t>
       </w:r>
     </w:p>
-    <w:bookmarkEnd w:id="18"/>
     <w:bookmarkEnd w:id="19"/>
+    <w:bookmarkEnd w:id="20"/>
     <w:sectPr>
       <w:footnotePr>
         <w:numRestart w:val="eachSect"/>
@@ -640,6 +746,9 @@
     <w:abstractNumId w:val="991"/>
   </w:num>
   <w:num w:numId="1010">
+    <w:abstractNumId w:val="991"/>
+  </w:num>
+  <w:num w:numId="1011">
     <w:abstractNumId w:val="991"/>
   </w:num>
 </w:numbering>

</xml_diff>